<commit_message>
CU-ZC-042 Address PR review findings for Docling evaluation
</commit_message>
<xml_diff>
--- a/evaluation/fixtures/F08_structured.docx
+++ b/evaluation/fixtures/F08_structured.docx
@@ -203,7 +203,19 @@
     <w:p/>
     <w:p>
       <w:r>
-        <w:t>Repository link: https://github.com/zlet-labs/zlet-converter</w:t>
+        <w:t xml:space="preserve">For complete source code and updates, visit the </w:t>
+      </w:r>
+      <w:hyperlink r:id="rId9">
+        <w:r>
+          <w:rPr>
+            <w:color w:val="0000FF"/>
+            <w:u w:val="single"/>
+          </w:rPr>
+          <w:t>Zlet Converter GitHub Repository</w:t>
+        </w:r>
+      </w:hyperlink>
+      <w:r>
+        <w:t>.</w:t>
       </w:r>
     </w:p>
     <w:sectPr>

</xml_diff>